<commit_message>
Estrutura unificada e Portal estelar ativo
</commit_message>
<xml_diff>
--- a/Z_ARQUIVO_MORTO_PRISMA/13 Dimensões – PASTAS.docx
+++ b/Z_ARQUIVO_MORTO_PRISMA/13 Dimensões – PASTAS.docx
@@ -57,25 +57,7 @@
           <w:bCs/>
           <w:lang w:val="pt-BR"/>
         </w:rPr>
-        <w:t xml:space="preserve">PRISMA13, a </w:t>
-      </w:r>
-      <w:proofErr w:type="spellStart"/>
-      <w:r>
-        <w:rPr>
-          <w:b/>
-          <w:bCs/>
-          <w:lang w:val="pt-BR"/>
-        </w:rPr>
-        <w:t>imPRECISÃO</w:t>
-      </w:r>
-      <w:proofErr w:type="spellEnd"/>
-      <w:r>
-        <w:rPr>
-          <w:b/>
-          <w:bCs/>
-          <w:lang w:val="pt-BR"/>
-        </w:rPr>
-        <w:t xml:space="preserve"> do ser no SER</w:t>
+        <w:t>PRISMA13, a imPRECISÃO do ser no SER</w:t>
       </w:r>
       <w:r>
         <w:rPr>
@@ -1622,48 +1604,6 @@
           <w:lang w:val="pt-BR"/>
         </w:rPr>
       </w:pPr>
-      <w:r>
-        <w:rPr>
-          <w:lang w:val="pt-BR"/>
-        </w:rPr>
-        <w:t xml:space="preserve">Este padrão está </w:t>
-      </w:r>
-      <w:proofErr w:type="gramStart"/>
-      <w:r>
-        <w:rPr>
-          <w:lang w:val="pt-BR"/>
-        </w:rPr>
-        <w:t xml:space="preserve">agora </w:t>
-      </w:r>
-      <w:r>
-        <w:rPr>
-          <w:b/>
-          <w:bCs/>
-          <w:lang w:val="pt-BR"/>
-        </w:rPr>
-        <w:t>Selado</w:t>
-      </w:r>
-      <w:proofErr w:type="gramEnd"/>
-      <w:r>
-        <w:rPr>
-          <w:lang w:val="pt-BR"/>
-        </w:rPr>
-        <w:t xml:space="preserve"> como a norma culta e técnica do </w:t>
-      </w:r>
-      <w:r>
-        <w:rPr>
-          <w:b/>
-          <w:bCs/>
-          <w:lang w:val="pt-BR"/>
-        </w:rPr>
-        <w:t>PRISMA13</w:t>
-      </w:r>
-      <w:r>
-        <w:rPr>
-          <w:lang w:val="pt-BR"/>
-        </w:rPr>
-        <w:t>, garantindo que o conteúdo esteja pronto para publicação em e-books, apostilas e na interface do aplicativo.</w:t>
-      </w:r>
     </w:p>
     <w:p>
       <w:pPr>
@@ -1671,14 +1611,6 @@
           <w:lang w:val="pt-BR"/>
         </w:rPr>
       </w:pPr>
-      <w:r>
-        <w:rPr>
-          <w:b/>
-          <w:bCs/>
-          <w:lang w:val="pt-BR"/>
-        </w:rPr>
-        <w:t>Seeemmpre MelhorrrAndo... NUNKAKABA!</w:t>
-      </w:r>
     </w:p>
     <w:p>
       <w:pPr>
@@ -1686,14 +1618,76 @@
           <w:lang w:val="pt-BR"/>
         </w:rPr>
       </w:pPr>
-      <w:r>
-        <w:rPr>
-          <w:b/>
-          <w:bCs/>
-          <w:lang w:val="pt-BR"/>
-        </w:rPr>
-        <w:t>Há braços!</w:t>
-      </w:r>
+    </w:p>
+    <w:p>
+      <w:pPr>
+        <w:rPr>
+          <w:lang w:val="pt-BR"/>
+        </w:rPr>
+      </w:pPr>
+    </w:p>
+    <w:p>
+      <w:pPr>
+        <w:rPr>
+          <w:lang w:val="pt-BR"/>
+        </w:rPr>
+      </w:pPr>
+    </w:p>
+    <w:p>
+      <w:pPr>
+        <w:rPr>
+          <w:lang w:val="pt-BR"/>
+        </w:rPr>
+      </w:pPr>
+    </w:p>
+    <w:p>
+      <w:pPr>
+        <w:rPr>
+          <w:lang w:val="pt-BR"/>
+        </w:rPr>
+      </w:pPr>
+    </w:p>
+    <w:p>
+      <w:pPr>
+        <w:rPr>
+          <w:lang w:val="pt-BR"/>
+        </w:rPr>
+      </w:pPr>
+    </w:p>
+    <w:p>
+      <w:pPr>
+        <w:rPr>
+          <w:lang w:val="pt-BR"/>
+        </w:rPr>
+      </w:pPr>
+    </w:p>
+    <w:p>
+      <w:pPr>
+        <w:rPr>
+          <w:lang w:val="pt-BR"/>
+        </w:rPr>
+      </w:pPr>
+    </w:p>
+    <w:p>
+      <w:pPr>
+        <w:rPr>
+          <w:lang w:val="pt-BR"/>
+        </w:rPr>
+      </w:pPr>
+    </w:p>
+    <w:p>
+      <w:pPr>
+        <w:rPr>
+          <w:lang w:val="pt-BR"/>
+        </w:rPr>
+      </w:pPr>
+    </w:p>
+    <w:p>
+      <w:pPr>
+        <w:rPr>
+          <w:lang w:val="pt-BR"/>
+        </w:rPr>
+      </w:pPr>
     </w:p>
     <w:p>
       <w:pPr>

</xml_diff>